<commit_message>
Document oscilloscope trigger configuration in ARCHITECTURE.md and BIS_BRD.docx
</commit_message>
<xml_diff>
--- a/docs/BIS_BRD.docx
+++ b/docs/BIS_BRD.docx
@@ -3574,7 +3574,7 @@
                 <w:sz w:val="20"/>
                 <w:szCs w:val="20"/>
               </w:rPr>
-              <w:t xml:space="preserve">Current channel and timebase settings</w:t>
+              <w:t xml:space="preserve">Current channel, timebase, and trigger settings</w:t>
             </w:r>
           </w:p>
         </w:tc>
@@ -3692,7 +3692,7 @@
                 <w:sz w:val="20"/>
                 <w:szCs w:val="20"/>
               </w:rPr>
-              <w:t xml:space="preserve">Set channel coupling, scale, offset, probe, timebase</w:t>
+              <w:t xml:space="preserve">Set channel coupling, scale, offset, probe, timebase, trigger</w:t>
             </w:r>
           </w:p>
         </w:tc>

</xml_diff>